<commit_message>
Second commit to Push References for Git in Capstone project.docx
</commit_message>
<xml_diff>
--- a/References for Git in Capstone project.docx
+++ b/References for Git in Capstone project.docx
@@ -8,19 +8,39 @@
       </w:r>
     </w:p>
     <w:p>
-      <w:r>
-        <w:t>C:\Users\LENOVO</w:t>
-      </w:r>
-      <w:r>
-        <w:t>&gt; cd Document</w:t>
-      </w:r>
-    </w:p>
-    <w:p>
-      <w:r>
-        <w:t xml:space="preserve">then </w:t>
-      </w:r>
-      <w:r>
-        <w:t xml:space="preserve">cd </w:t>
+      <w:proofErr w:type="spellStart"/>
+      <w:r>
+        <w:t>Youtube</w:t>
+      </w:r>
+      <w:proofErr w:type="spellEnd"/>
+      <w:r>
+        <w:t xml:space="preserve"> Reference to start with Git and </w:t>
+      </w:r>
+      <w:proofErr w:type="spellStart"/>
+      <w:r>
+        <w:t>Github</w:t>
+      </w:r>
+      <w:proofErr w:type="spellEnd"/>
+      <w:r>
+        <w:t>:</w:t>
+      </w:r>
+    </w:p>
+    <w:p>
+      <w:r>
+        <w:rPr>
+          <w:highlight w:val="yellow"/>
+        </w:rPr>
+        <w:t>https://www.youtube.com/watch?v=dCumPjv1r8I</w:t>
+      </w:r>
+    </w:p>
+    <w:p>
+      <w:r>
+        <w:t>C:\Users\LENOVO&gt; cd Document</w:t>
+      </w:r>
+    </w:p>
+    <w:p>
+      <w:r>
+        <w:t xml:space="preserve">then cd </w:t>
       </w:r>
       <w:proofErr w:type="spellStart"/>
       <w:r>
@@ -41,6 +61,19 @@
     </w:p>
     <w:p>
       <w:r>
+        <w:t>C:\Users\LENOVO\Documents\Dheeba\Asphero_CapstoneProject&gt;</w:t>
+      </w:r>
+      <w:r>
+        <w:t xml:space="preserve">git </w:t>
+      </w:r>
+      <w:proofErr w:type="spellStart"/>
+      <w:r>
+        <w:t>init</w:t>
+      </w:r>
+      <w:proofErr w:type="spellEnd"/>
+    </w:p>
+    <w:p>
+      <w:r>
         <w:t>C:\Users\LENOVO\Documents\Dheeba\Asphero_CapstoneProject&gt;notepad .</w:t>
       </w:r>
       <w:proofErr w:type="spellStart"/>
@@ -59,12 +92,18 @@
         <w:rPr>
           <w:highlight w:val="yellow"/>
         </w:rPr>
-        <w:t xml:space="preserve">This asked me to create a notebook </w:t>
+        <w:t>This asked me to create a note</w:t>
       </w:r>
       <w:r>
         <w:rPr>
           <w:highlight w:val="yellow"/>
         </w:rPr>
+        <w:t xml:space="preserve">pad called </w:t>
+      </w:r>
+      <w:r>
+        <w:rPr>
+          <w:highlight w:val="yellow"/>
+        </w:rPr>
         <w:t>.</w:t>
       </w:r>
       <w:proofErr w:type="spellStart"/>
@@ -164,13 +203,8 @@
     <w:p/>
     <w:p>
       <w:r>
-        <w:t>C:\Users\LENOVO\Documents\Dheeba\Asphero_CapstoneProject&gt;git add --</w:t>
-      </w:r>
-      <w:proofErr w:type="gramStart"/>
-      <w:r>
-        <w:t>renormalize .</w:t>
-      </w:r>
-      <w:proofErr w:type="gramEnd"/>
+        <w:t>C:\Users\LENOVO\Documents\Dheeba\Asphero_CapstoneProject&gt;git add --renormalize .</w:t>
+      </w:r>
     </w:p>
     <w:p/>
     <w:p>
@@ -256,6 +290,7 @@
     </w:p>
     <w:p>
       <w:r>
+        <w:lastRenderedPageBreak/>
         <w:t xml:space="preserve">        new file:   laytime_sample_pack/answer_key/cases.py</w:t>
       </w:r>
     </w:p>
@@ -271,11 +306,670 @@
     </w:p>
     <w:p>
       <w:r>
+        <w:t xml:space="preserve">        new file:   </w:t>
+      </w:r>
+      <w:proofErr w:type="spellStart"/>
+      <w:r>
+        <w:t>laytime_sample_pack</w:t>
+      </w:r>
+      <w:proofErr w:type="spellEnd"/>
+      <w:r>
+        <w:t>/</w:t>
+      </w:r>
+      <w:proofErr w:type="spellStart"/>
+      <w:r>
+        <w:t>case_A_coral_meridian</w:t>
+      </w:r>
+      <w:proofErr w:type="spellEnd"/>
+      <w:r>
+        <w:t>/charter_party.pdf</w:t>
+      </w:r>
+    </w:p>
+    <w:p>
+      <w:r>
+        <w:t xml:space="preserve">        new file:   laytime_sample_pack/case_A_coral_meridian/notice_of_readiness.pdf</w:t>
+      </w:r>
+    </w:p>
+    <w:p>
+      <w:r>
+        <w:t xml:space="preserve">        new file:   </w:t>
+      </w:r>
+      <w:proofErr w:type="spellStart"/>
+      <w:r>
+        <w:t>laytime_sample_pack</w:t>
+      </w:r>
+      <w:proofErr w:type="spellEnd"/>
+      <w:r>
+        <w:t>/</w:t>
+      </w:r>
+      <w:proofErr w:type="spellStart"/>
+      <w:r>
+        <w:t>case_A_coral_meridian</w:t>
+      </w:r>
+      <w:proofErr w:type="spellEnd"/>
+      <w:r>
+        <w:t>/port_weather_log.csv</w:t>
+      </w:r>
+    </w:p>
+    <w:p>
+      <w:r>
+        <w:t xml:space="preserve">        new file:   </w:t>
+      </w:r>
+      <w:proofErr w:type="spellStart"/>
+      <w:r>
+        <w:t>laytime_sample_pack</w:t>
+      </w:r>
+      <w:proofErr w:type="spellEnd"/>
+      <w:r>
+        <w:t>/</w:t>
+      </w:r>
+      <w:proofErr w:type="spellStart"/>
+      <w:r>
+        <w:t>case_A_coral_meridian</w:t>
+      </w:r>
+      <w:proofErr w:type="spellEnd"/>
+      <w:r>
+        <w:t>/statement_of_facts.pdf</w:t>
+      </w:r>
+    </w:p>
+    <w:p>
+      <w:r>
+        <w:t xml:space="preserve">        new file:   </w:t>
+      </w:r>
+      <w:proofErr w:type="spellStart"/>
+      <w:r>
+        <w:t>laytime_sample_pack</w:t>
+      </w:r>
+      <w:proofErr w:type="spellEnd"/>
+      <w:r>
+        <w:t>/</w:t>
+      </w:r>
+      <w:proofErr w:type="spellStart"/>
+      <w:r>
+        <w:t>case_B_aster_horizon</w:t>
+      </w:r>
+      <w:proofErr w:type="spellEnd"/>
+      <w:r>
+        <w:t>/charter_party.pdf</w:t>
+      </w:r>
+    </w:p>
+    <w:p>
+      <w:r>
+        <w:t xml:space="preserve">        new file:   </w:t>
+      </w:r>
+      <w:proofErr w:type="spellStart"/>
+      <w:r>
+        <w:t>laytime_sample_pack</w:t>
+      </w:r>
+      <w:proofErr w:type="spellEnd"/>
+      <w:r>
+        <w:t>/</w:t>
+      </w:r>
+      <w:proofErr w:type="spellStart"/>
+      <w:r>
+        <w:t>case_B_aster_horizon</w:t>
+      </w:r>
+      <w:proofErr w:type="spellEnd"/>
+      <w:r>
+        <w:t>/notice_of_readiness.pdf</w:t>
+      </w:r>
+    </w:p>
+    <w:p>
+      <w:r>
+        <w:t xml:space="preserve">        new file:   </w:t>
+      </w:r>
+      <w:proofErr w:type="spellStart"/>
+      <w:r>
+        <w:t>laytime_sample_pack</w:t>
+      </w:r>
+      <w:proofErr w:type="spellEnd"/>
+      <w:r>
+        <w:t>/</w:t>
+      </w:r>
+      <w:proofErr w:type="spellStart"/>
+      <w:r>
+        <w:t>case_B_aster_horizon</w:t>
+      </w:r>
+      <w:proofErr w:type="spellEnd"/>
+      <w:r>
+        <w:t>/port_weather_log.csv</w:t>
+      </w:r>
+    </w:p>
+    <w:p>
+      <w:r>
+        <w:t xml:space="preserve">        new file:   </w:t>
+      </w:r>
+      <w:proofErr w:type="spellStart"/>
+      <w:r>
+        <w:t>laytime_sample_pack</w:t>
+      </w:r>
+      <w:proofErr w:type="spellEnd"/>
+      <w:r>
+        <w:t>/</w:t>
+      </w:r>
+      <w:proofErr w:type="spellStart"/>
+      <w:r>
+        <w:t>case_B_aster_horizon</w:t>
+      </w:r>
+      <w:proofErr w:type="spellEnd"/>
+      <w:r>
+        <w:t>/statement_of_facts.pdf</w:t>
+      </w:r>
+    </w:p>
+    <w:p>
+      <w:r>
+        <w:t xml:space="preserve">        new file:   </w:t>
+      </w:r>
+      <w:proofErr w:type="spellStart"/>
+      <w:r>
+        <w:t>laytime_sample_pack</w:t>
+      </w:r>
+      <w:proofErr w:type="spellEnd"/>
+      <w:r>
+        <w:t>/</w:t>
+      </w:r>
+      <w:proofErr w:type="spellStart"/>
+      <w:r>
+        <w:t>case_C_seren_talon</w:t>
+      </w:r>
+      <w:proofErr w:type="spellEnd"/>
+      <w:r>
+        <w:t>/charter_party.pdf</w:t>
+      </w:r>
+    </w:p>
+    <w:p>
+      <w:r>
+        <w:t xml:space="preserve">        new file:   laytime_sample_pack/case_C_seren_talon/fixture_negotiation_emails.pdf</w:t>
+      </w:r>
+    </w:p>
+    <w:p>
+      <w:r>
+        <w:t xml:space="preserve">        new file:   </w:t>
+      </w:r>
+      <w:proofErr w:type="spellStart"/>
+      <w:r>
+        <w:t>laytime_sample_pack</w:t>
+      </w:r>
+      <w:proofErr w:type="spellEnd"/>
+      <w:r>
+        <w:t>/</w:t>
+      </w:r>
+      <w:proofErr w:type="spellStart"/>
+      <w:r>
+        <w:t>case_C_seren_talon</w:t>
+      </w:r>
+      <w:proofErr w:type="spellEnd"/>
+      <w:r>
+        <w:t>/fixture_recap_email.pdf</w:t>
+      </w:r>
+    </w:p>
+    <w:p>
+      <w:r>
+        <w:t xml:space="preserve">        new file:   laytime_sample_pack/case_C_seren_talon/images/ais_track_screenshot.png</w:t>
+      </w:r>
+    </w:p>
+    <w:p>
+      <w:r>
+        <w:t xml:space="preserve">        new file:   laytime_sample_pack/case_C_seren_talon/images/deck_log_16jun2026.jpg</w:t>
+      </w:r>
+    </w:p>
+    <w:p>
+      <w:r>
+        <w:t xml:space="preserve">        new file:   laytime_sample_pack/case_C_seren_talon/images/sof_signed_scan.jpg</w:t>
+      </w:r>
+    </w:p>
+    <w:p>
+      <w:r>
+        <w:t xml:space="preserve">        new file:   </w:t>
+      </w:r>
+      <w:proofErr w:type="spellStart"/>
+      <w:r>
+        <w:t>laytime_sample_pack</w:t>
+      </w:r>
+      <w:proofErr w:type="spellEnd"/>
+      <w:r>
+        <w:t>/</w:t>
+      </w:r>
+      <w:proofErr w:type="spellStart"/>
+      <w:r>
+        <w:t>case_C_seren_talon</w:t>
+      </w:r>
+      <w:proofErr w:type="spellEnd"/>
+      <w:r>
+        <w:t>/notice_of_readiness_1.pdf</w:t>
+      </w:r>
+    </w:p>
+    <w:p>
+      <w:r>
+        <w:t xml:space="preserve">        new file:   </w:t>
+      </w:r>
+      <w:proofErr w:type="spellStart"/>
+      <w:r>
+        <w:t>laytime_sample_pack</w:t>
+      </w:r>
+      <w:proofErr w:type="spellEnd"/>
+      <w:r>
+        <w:t>/</w:t>
+      </w:r>
+      <w:proofErr w:type="spellStart"/>
+      <w:r>
+        <w:t>case_C_seren_talon</w:t>
+      </w:r>
+      <w:proofErr w:type="spellEnd"/>
+      <w:r>
+        <w:t>/notice_of_readiness_2.pdf</w:t>
+      </w:r>
+    </w:p>
+    <w:p>
+      <w:r>
+        <w:t xml:space="preserve">        new file:   </w:t>
+      </w:r>
+      <w:proofErr w:type="spellStart"/>
+      <w:r>
+        <w:t>laytime_sample_pack</w:t>
+      </w:r>
+      <w:proofErr w:type="spellEnd"/>
+      <w:r>
+        <w:t>/</w:t>
+      </w:r>
+      <w:proofErr w:type="spellStart"/>
+      <w:r>
+        <w:t>case_C_seren_talon</w:t>
+      </w:r>
+      <w:proofErr w:type="spellEnd"/>
+      <w:r>
+        <w:t>/port_weather_log.csv</w:t>
+      </w:r>
+    </w:p>
+    <w:p>
+      <w:r>
+        <w:t xml:space="preserve">        new file:   </w:t>
+      </w:r>
+      <w:proofErr w:type="spellStart"/>
+      <w:r>
+        <w:t>laytime_sample_pack</w:t>
+      </w:r>
+      <w:proofErr w:type="spellEnd"/>
+      <w:r>
+        <w:t>/</w:t>
+      </w:r>
+      <w:proofErr w:type="spellStart"/>
+      <w:r>
+        <w:t>case_C_seren_talon</w:t>
+      </w:r>
+      <w:proofErr w:type="spellEnd"/>
+      <w:r>
+        <w:t>/statement_of_facts.pdf</w:t>
+      </w:r>
+    </w:p>
+    <w:p>
+      <w:r>
+        <w:t xml:space="preserve">        new file:   </w:t>
+      </w:r>
+      <w:proofErr w:type="spellStart"/>
+      <w:r>
+        <w:t>laytime_sample_pack</w:t>
+      </w:r>
+      <w:proofErr w:type="spellEnd"/>
+      <w:r>
+        <w:t>/shared/company_standard_laytime_terms.pdf</w:t>
+      </w:r>
+    </w:p>
+    <w:p>
+      <w:r>
+        <w:t xml:space="preserve">        new file:   laytime_sample_pack/shared/demurrage_claim_letter_template.md</w:t>
+      </w:r>
+    </w:p>
+    <w:p>
+      <w:r>
+        <w:t xml:space="preserve">        new file:   </w:t>
+      </w:r>
+      <w:proofErr w:type="spellStart"/>
+      <w:r>
+        <w:t>laytime_sample_pack</w:t>
+      </w:r>
+      <w:proofErr w:type="spellEnd"/>
+      <w:r>
+        <w:t>/shared/</w:t>
+      </w:r>
+      <w:proofErr w:type="spellStart"/>
+      <w:r>
+        <w:t>past_claims_history.json</w:t>
+      </w:r>
+      <w:proofErr w:type="spellEnd"/>
+    </w:p>
+    <w:p>
+      <w:r>
+        <w:t xml:space="preserve">        new file:   </w:t>
+      </w:r>
+      <w:proofErr w:type="spellStart"/>
+      <w:r>
+        <w:t>laytime_sample_pack</w:t>
+      </w:r>
+      <w:proofErr w:type="spellEnd"/>
+      <w:r>
+        <w:t>/shared/port_holidays_2026.csv</w:t>
+      </w:r>
+    </w:p>
+    <w:p>
+      <w:r>
+        <w:t xml:space="preserve">        new file:   </w:t>
+      </w:r>
+      <w:proofErr w:type="spellStart"/>
+      <w:r>
+        <w:t>laytime_sample_pack</w:t>
+      </w:r>
+      <w:proofErr w:type="spellEnd"/>
+      <w:r>
+        <w:t>/shared/</w:t>
+      </w:r>
+      <w:proofErr w:type="spellStart"/>
+      <w:r>
+        <w:t>port_information.json</w:t>
+      </w:r>
+      <w:proofErr w:type="spellEnd"/>
+    </w:p>
+    <w:p>
+      <w:r>
+        <w:t xml:space="preserve">        new file:   </w:t>
+      </w:r>
+      <w:proofErr w:type="spellStart"/>
+      <w:r>
+        <w:t>zzAll</w:t>
+      </w:r>
+      <w:proofErr w:type="spellEnd"/>
+      <w:r>
+        <w:t xml:space="preserve"> Related files/Initial requirements.txt</w:t>
+      </w:r>
+    </w:p>
+    <w:p>
+      <w:r>
+        <w:t xml:space="preserve">        new file:   </w:t>
+      </w:r>
+      <w:proofErr w:type="spellStart"/>
+      <w:r>
+        <w:t>zzAll</w:t>
+      </w:r>
+      <w:proofErr w:type="spellEnd"/>
+      <w:r>
+        <w:t xml:space="preserve"> Related files/ais_track_screenshot.png</w:t>
+      </w:r>
+    </w:p>
+    <w:p>
+      <w:r>
+        <w:t xml:space="preserve">        new file:   </w:t>
+      </w:r>
+      <w:proofErr w:type="spellStart"/>
+      <w:r>
+        <w:t>zzAll</w:t>
+      </w:r>
+      <w:proofErr w:type="spellEnd"/>
+      <w:r>
+        <w:t xml:space="preserve"> Related files/deck_log_16jun2026.jpg</w:t>
+      </w:r>
+    </w:p>
+    <w:p>
+      <w:r>
         <w:lastRenderedPageBreak/>
         <w:t xml:space="preserve">        new file:   </w:t>
       </w:r>
       <w:proofErr w:type="spellStart"/>
       <w:r>
+        <w:t>zzAll</w:t>
+      </w:r>
+      <w:proofErr w:type="spellEnd"/>
+      <w:r>
+        <w:t xml:space="preserve"> Related files/laytime and demurrage agent.docx</w:t>
+      </w:r>
+    </w:p>
+    <w:p>
+      <w:r>
+        <w:t xml:space="preserve">        new file:   </w:t>
+      </w:r>
+      <w:proofErr w:type="spellStart"/>
+      <w:r>
+        <w:t>zzAll</w:t>
+      </w:r>
+      <w:proofErr w:type="spellEnd"/>
+      <w:r>
+        <w:t xml:space="preserve"> Related files/laytime_agent_architecture.jpg</w:t>
+      </w:r>
+    </w:p>
+    <w:p>
+      <w:r>
+        <w:t xml:space="preserve">        new file:   </w:t>
+      </w:r>
+      <w:proofErr w:type="spellStart"/>
+      <w:r>
+        <w:t>zzAll</w:t>
+      </w:r>
+      <w:proofErr w:type="spellEnd"/>
+      <w:r>
+        <w:t xml:space="preserve"> Related files/</w:t>
+      </w:r>
+      <w:proofErr w:type="spellStart"/>
+      <w:r>
+        <w:t>laytime_agent_architecture.svg</w:t>
+      </w:r>
+      <w:proofErr w:type="spellEnd"/>
+    </w:p>
+    <w:p>
+      <w:r>
+        <w:t xml:space="preserve">        new file:   </w:t>
+      </w:r>
+      <w:proofErr w:type="spellStart"/>
+      <w:r>
+        <w:t>zzAll</w:t>
+      </w:r>
+      <w:proofErr w:type="spellEnd"/>
+      <w:r>
+        <w:t xml:space="preserve"> Related files/laytime_sample_pack.zip</w:t>
+      </w:r>
+    </w:p>
+    <w:p>
+      <w:r>
+        <w:t xml:space="preserve">        new file:   </w:t>
+      </w:r>
+      <w:proofErr w:type="spellStart"/>
+      <w:r>
+        <w:t>zzAll</w:t>
+      </w:r>
+      <w:proofErr w:type="spellEnd"/>
+      <w:r>
+        <w:t xml:space="preserve"> Related files/laytime_sample_pack_v3_with_images.zip</w:t>
+      </w:r>
+    </w:p>
+    <w:p>
+      <w:r>
+        <w:t xml:space="preserve">        new file:   </w:t>
+      </w:r>
+      <w:proofErr w:type="spellStart"/>
+      <w:r>
+        <w:t>zzAll</w:t>
+      </w:r>
+      <w:proofErr w:type="spellEnd"/>
+      <w:r>
+        <w:t xml:space="preserve"> Related files/sof_signed_scan.jpg</w:t>
+      </w:r>
+    </w:p>
+    <w:p>
+      <w:pPr>
+        <w:pBdr>
+          <w:bottom w:val="double" w:sz="6" w:space="1" w:color="auto"/>
+        </w:pBdr>
+      </w:pPr>
+      <w:r>
+        <w:t>C:\Users\LENOVO\Documents\Dheeba\Asphero_CapstoneProject&gt;</w:t>
+      </w:r>
+    </w:p>
+    <w:p/>
+    <w:p>
+      <w:r>
+        <w:rPr>
+          <w:highlight w:val="green"/>
+        </w:rPr>
+        <w:t xml:space="preserve">Commit to </w:t>
+      </w:r>
+      <w:r>
+        <w:rPr>
+          <w:highlight w:val="green"/>
+        </w:rPr>
+        <w:t xml:space="preserve">local </w:t>
+      </w:r>
+      <w:r>
+        <w:rPr>
+          <w:highlight w:val="green"/>
+        </w:rPr>
+        <w:t>gi</w:t>
+      </w:r>
+      <w:r>
+        <w:rPr>
+          <w:highlight w:val="green"/>
+        </w:rPr>
+        <w:t>t first</w:t>
+      </w:r>
+      <w:r>
+        <w:rPr>
+          <w:highlight w:val="green"/>
+        </w:rPr>
+        <w:t>:</w:t>
+      </w:r>
+    </w:p>
+    <w:p>
+      <w:r>
+        <w:t xml:space="preserve">C:\Users\LENOVO\Documents\Dheeba\Asphero_CapstoneProject&gt;git commit -m "First commit to Push All Files to </w:t>
+      </w:r>
+      <w:proofErr w:type="spellStart"/>
+      <w:r>
+        <w:t>Github</w:t>
+      </w:r>
+      <w:proofErr w:type="spellEnd"/>
+      <w:r>
+        <w:t>"</w:t>
+      </w:r>
+    </w:p>
+    <w:p>
+      <w:r>
+        <w:t>Enumerating objects: 48, done.</w:t>
+      </w:r>
+    </w:p>
+    <w:p>
+      <w:r>
+        <w:t>Counting objects: 100% (48/48), done.</w:t>
+      </w:r>
+    </w:p>
+    <w:p>
+      <w:r>
+        <w:t>Delta compression using up to 4 threads</w:t>
+      </w:r>
+    </w:p>
+    <w:p>
+      <w:r>
+        <w:t>Compressing objects: 100% (48/48), done.</w:t>
+      </w:r>
+    </w:p>
+    <w:p>
+      <w:r>
+        <w:t>Writing objects: 100% (48/48), done.</w:t>
+      </w:r>
+    </w:p>
+    <w:p>
+      <w:r>
+        <w:t>Total 48 (delta 6), reused 0 (delta 0), pack-reused 0 (from 0)</w:t>
+      </w:r>
+    </w:p>
+    <w:p>
+      <w:r>
+        <w:t xml:space="preserve">[master (root-commit) a471fe3] First commit to Push All Files to </w:t>
+      </w:r>
+      <w:proofErr w:type="spellStart"/>
+      <w:r>
+        <w:t>Github</w:t>
+      </w:r>
+      <w:proofErr w:type="spellEnd"/>
+    </w:p>
+    <w:p>
+      <w:r>
+        <w:t xml:space="preserve"> 42 files changed, 2306 insertions(+)</w:t>
+      </w:r>
+    </w:p>
+    <w:p>
+      <w:r>
+        <w:t xml:space="preserve"> create mode 100644 .</w:t>
+      </w:r>
+      <w:proofErr w:type="spellStart"/>
+      <w:r>
+        <w:t>gitattributes</w:t>
+      </w:r>
+      <w:proofErr w:type="spellEnd"/>
+    </w:p>
+    <w:p>
+      <w:r>
+        <w:t xml:space="preserve"> create mode 100644 Initial requirements.txt</w:t>
+      </w:r>
+    </w:p>
+    <w:p>
+      <w:r>
+        <w:t xml:space="preserve"> create mode 100644 References for Git in Capstone project.docx</w:t>
+      </w:r>
+    </w:p>
+    <w:p>
+      <w:r>
+        <w:t xml:space="preserve"> create mode 100644 laytime_sample_pack/README.md</w:t>
+      </w:r>
+    </w:p>
+    <w:p>
+      <w:r>
+        <w:t xml:space="preserve"> create mode 100644 </w:t>
+      </w:r>
+      <w:proofErr w:type="spellStart"/>
+      <w:r>
+        <w:t>laytime_sample_pack</w:t>
+      </w:r>
+      <w:proofErr w:type="spellEnd"/>
+      <w:r>
+        <w:t>/</w:t>
+      </w:r>
+      <w:proofErr w:type="spellStart"/>
+      <w:r>
+        <w:t>answer_key</w:t>
+      </w:r>
+      <w:proofErr w:type="spellEnd"/>
+      <w:r>
+        <w:t>/</w:t>
+      </w:r>
+      <w:proofErr w:type="spellStart"/>
+      <w:r>
+        <w:t>answer_key.json</w:t>
+      </w:r>
+      <w:proofErr w:type="spellEnd"/>
+    </w:p>
+    <w:p>
+      <w:r>
+        <w:t xml:space="preserve"> create mode 100644 laytime_sample_pack/answer_key/answer_key.md</w:t>
+      </w:r>
+    </w:p>
+    <w:p>
+      <w:r>
+        <w:t xml:space="preserve"> create mode 100644 laytime_sample_pack/answer_key/cases.py</w:t>
+      </w:r>
+    </w:p>
+    <w:p>
+      <w:r>
+        <w:t xml:space="preserve"> create mode 100644 laytime_sample_pack/answer_key/gen.py</w:t>
+      </w:r>
+    </w:p>
+    <w:p>
+      <w:r>
+        <w:t xml:space="preserve"> create mode 100644 laytime_sample_pack/answer_key/gen_images.py</w:t>
+      </w:r>
+    </w:p>
+    <w:p>
+      <w:r>
+        <w:t xml:space="preserve"> create mode 100644 </w:t>
+      </w:r>
+      <w:proofErr w:type="spellStart"/>
+      <w:r>
         <w:t>laytime_sample_pack</w:t>
       </w:r>
       <w:proofErr w:type="spellEnd"/>
@@ -293,12 +987,13 @@
     </w:p>
     <w:p>
       <w:r>
-        <w:t xml:space="preserve">        new file:   laytime_sample_pack/case_A_coral_meridian/notice_of_readiness.pdf</w:t>
-      </w:r>
-    </w:p>
-    <w:p>
-      <w:r>
-        <w:t xml:space="preserve">        new file:   </w:t>
+        <w:lastRenderedPageBreak/>
+        <w:t xml:space="preserve"> create mode 100644 laytime_sample_pack/case_A_coral_meridian/notice_of_readiness.pdf</w:t>
+      </w:r>
+    </w:p>
+    <w:p>
+      <w:r>
+        <w:t xml:space="preserve"> create mode 100644 </w:t>
       </w:r>
       <w:proofErr w:type="spellStart"/>
       <w:r>
@@ -319,7 +1014,7 @@
     </w:p>
     <w:p>
       <w:r>
-        <w:t xml:space="preserve">        new file:   </w:t>
+        <w:t xml:space="preserve"> create mode 100644 </w:t>
       </w:r>
       <w:proofErr w:type="spellStart"/>
       <w:r>
@@ -340,7 +1035,7 @@
     </w:p>
     <w:p>
       <w:r>
-        <w:t xml:space="preserve">        new file:   </w:t>
+        <w:t xml:space="preserve"> create mode 100644 </w:t>
       </w:r>
       <w:proofErr w:type="spellStart"/>
       <w:r>
@@ -361,7 +1056,7 @@
     </w:p>
     <w:p>
       <w:r>
-        <w:t xml:space="preserve">        new file:   </w:t>
+        <w:t xml:space="preserve"> create mode 100644 </w:t>
       </w:r>
       <w:proofErr w:type="spellStart"/>
       <w:r>
@@ -382,7 +1077,7 @@
     </w:p>
     <w:p>
       <w:r>
-        <w:t xml:space="preserve">        new file:   </w:t>
+        <w:t xml:space="preserve"> create mode 100644 </w:t>
       </w:r>
       <w:proofErr w:type="spellStart"/>
       <w:r>
@@ -403,7 +1098,7 @@
     </w:p>
     <w:p>
       <w:r>
-        <w:t xml:space="preserve">        new file:   </w:t>
+        <w:t xml:space="preserve"> create mode 100644 </w:t>
       </w:r>
       <w:proofErr w:type="spellStart"/>
       <w:r>
@@ -424,7 +1119,7 @@
     </w:p>
     <w:p>
       <w:r>
-        <w:t xml:space="preserve">        new file:   </w:t>
+        <w:t xml:space="preserve"> create mode 100644 </w:t>
       </w:r>
       <w:proofErr w:type="spellStart"/>
       <w:r>
@@ -445,12 +1140,12 @@
     </w:p>
     <w:p>
       <w:r>
-        <w:t xml:space="preserve">        new file:   laytime_sample_pack/case_C_seren_talon/fixture_negotiation_emails.pdf</w:t>
-      </w:r>
-    </w:p>
-    <w:p>
-      <w:r>
-        <w:t xml:space="preserve">        new file:   </w:t>
+        <w:t xml:space="preserve"> create mode 100644 laytime_sample_pack/case_C_seren_talon/fixture_negotiation_emails.pdf</w:t>
+      </w:r>
+    </w:p>
+    <w:p>
+      <w:r>
+        <w:t xml:space="preserve"> create mode 100644 </w:t>
       </w:r>
       <w:proofErr w:type="spellStart"/>
       <w:r>
@@ -471,22 +1166,22 @@
     </w:p>
     <w:p>
       <w:r>
-        <w:t xml:space="preserve">        new file:   laytime_sample_pack/case_C_seren_talon/images/ais_track_screenshot.png</w:t>
-      </w:r>
-    </w:p>
-    <w:p>
-      <w:r>
-        <w:t xml:space="preserve">        new file:   laytime_sample_pack/case_C_seren_talon/images/deck_log_16jun2026.jpg</w:t>
-      </w:r>
-    </w:p>
-    <w:p>
-      <w:r>
-        <w:t xml:space="preserve">        new file:   laytime_sample_pack/case_C_seren_talon/images/sof_signed_scan.jpg</w:t>
-      </w:r>
-    </w:p>
-    <w:p>
-      <w:r>
-        <w:t xml:space="preserve">        new file:   </w:t>
+        <w:t xml:space="preserve"> create mode 100644 laytime_sample_pack/case_C_seren_talon/images/ais_track_screenshot.png</w:t>
+      </w:r>
+    </w:p>
+    <w:p>
+      <w:r>
+        <w:t xml:space="preserve"> create mode 100644 laytime_sample_pack/case_C_seren_talon/images/deck_log_16jun2026.jpg</w:t>
+      </w:r>
+    </w:p>
+    <w:p>
+      <w:r>
+        <w:t xml:space="preserve"> create mode 100644 laytime_sample_pack/case_C_seren_talon/images/sof_signed_scan.jpg</w:t>
+      </w:r>
+    </w:p>
+    <w:p>
+      <w:r>
+        <w:t xml:space="preserve"> create mode 100644 </w:t>
       </w:r>
       <w:proofErr w:type="spellStart"/>
       <w:r>
@@ -507,7 +1202,7 @@
     </w:p>
     <w:p>
       <w:r>
-        <w:t xml:space="preserve">        new file:   </w:t>
+        <w:t xml:space="preserve"> create mode 100644 </w:t>
       </w:r>
       <w:proofErr w:type="spellStart"/>
       <w:r>
@@ -528,7 +1223,7 @@
     </w:p>
     <w:p>
       <w:r>
-        <w:t xml:space="preserve">        new file:   </w:t>
+        <w:t xml:space="preserve"> create mode 100644 </w:t>
       </w:r>
       <w:proofErr w:type="spellStart"/>
       <w:r>
@@ -549,7 +1244,7 @@
     </w:p>
     <w:p>
       <w:r>
-        <w:t xml:space="preserve">        new file:   </w:t>
+        <w:t xml:space="preserve"> create mode 100644 </w:t>
       </w:r>
       <w:proofErr w:type="spellStart"/>
       <w:r>
@@ -570,7 +1265,7 @@
     </w:p>
     <w:p>
       <w:r>
-        <w:t xml:space="preserve">        new file:   </w:t>
+        <w:t xml:space="preserve"> create mode 100644 </w:t>
       </w:r>
       <w:proofErr w:type="spellStart"/>
       <w:r>
@@ -583,12 +1278,12 @@
     </w:p>
     <w:p>
       <w:r>
-        <w:t xml:space="preserve">        new file:   laytime_sample_pack/shared/demurrage_claim_letter_template.md</w:t>
-      </w:r>
-    </w:p>
-    <w:p>
-      <w:r>
-        <w:t xml:space="preserve">        new file:   </w:t>
+        <w:t xml:space="preserve"> create mode 100644 laytime_sample_pack/shared/demurrage_claim_letter_template.md</w:t>
+      </w:r>
+    </w:p>
+    <w:p>
+      <w:r>
+        <w:t xml:space="preserve"> create mode 100644 </w:t>
       </w:r>
       <w:proofErr w:type="spellStart"/>
       <w:r>
@@ -606,7 +1301,7 @@
     </w:p>
     <w:p>
       <w:r>
-        <w:t xml:space="preserve">        new file:   </w:t>
+        <w:t xml:space="preserve"> create mode 100644 </w:t>
       </w:r>
       <w:proofErr w:type="spellStart"/>
       <w:r>
@@ -619,7 +1314,7 @@
     </w:p>
     <w:p>
       <w:r>
-        <w:t xml:space="preserve">        new file:   </w:t>
+        <w:t xml:space="preserve"> create mode 100644 </w:t>
       </w:r>
       <w:proofErr w:type="spellStart"/>
       <w:r>
@@ -637,7 +1332,7 @@
     </w:p>
     <w:p>
       <w:r>
-        <w:t xml:space="preserve">        new file:   </w:t>
+        <w:t xml:space="preserve"> create mode 100644 </w:t>
       </w:r>
       <w:proofErr w:type="spellStart"/>
       <w:r>
@@ -650,7 +1345,7 @@
     </w:p>
     <w:p>
       <w:r>
-        <w:t xml:space="preserve">        new file:   </w:t>
+        <w:t xml:space="preserve"> create mode 100644 </w:t>
       </w:r>
       <w:proofErr w:type="spellStart"/>
       <w:r>
@@ -663,7 +1358,7 @@
     </w:p>
     <w:p>
       <w:r>
-        <w:t xml:space="preserve">        new file:   </w:t>
+        <w:t xml:space="preserve"> create mode 100644 </w:t>
       </w:r>
       <w:proofErr w:type="spellStart"/>
       <w:r>
@@ -676,7 +1371,7 @@
     </w:p>
     <w:p>
       <w:r>
-        <w:t xml:space="preserve">        new file:   </w:t>
+        <w:t xml:space="preserve"> create mode 100644 </w:t>
       </w:r>
       <w:proofErr w:type="spellStart"/>
       <w:r>
@@ -689,7 +1384,7 @@
     </w:p>
     <w:p>
       <w:r>
-        <w:t xml:space="preserve">        new file:   </w:t>
+        <w:t xml:space="preserve"> create mode 100644 </w:t>
       </w:r>
       <w:proofErr w:type="spellStart"/>
       <w:r>
@@ -702,7 +1397,7 @@
     </w:p>
     <w:p>
       <w:r>
-        <w:t xml:space="preserve">        new file:   </w:t>
+        <w:t xml:space="preserve"> create mode 100644 </w:t>
       </w:r>
       <w:proofErr w:type="spellStart"/>
       <w:r>
@@ -720,8 +1415,21 @@
     </w:p>
     <w:p>
       <w:r>
+        <w:t xml:space="preserve"> create mode 100644 </w:t>
+      </w:r>
+      <w:proofErr w:type="spellStart"/>
+      <w:r>
+        <w:t>zzAll</w:t>
+      </w:r>
+      <w:proofErr w:type="spellEnd"/>
+      <w:r>
+        <w:t xml:space="preserve"> Related files/laytime_sample_pack.zip</w:t>
+      </w:r>
+    </w:p>
+    <w:p>
+      <w:r>
         <w:lastRenderedPageBreak/>
-        <w:t xml:space="preserve">        new file:   </w:t>
+        <w:t xml:space="preserve"> create mode 100644 </w:t>
       </w:r>
       <w:proofErr w:type="spellStart"/>
       <w:r>
@@ -729,12 +1437,12 @@
       </w:r>
       <w:proofErr w:type="spellEnd"/>
       <w:r>
-        <w:t xml:space="preserve"> Related files/laytime_sample_pack.zip</w:t>
-      </w:r>
-    </w:p>
-    <w:p>
-      <w:r>
-        <w:t xml:space="preserve">        new file:   </w:t>
+        <w:t xml:space="preserve"> Related files/laytime_sample_pack_v3_with_images.zip</w:t>
+      </w:r>
+    </w:p>
+    <w:p>
+      <w:r>
+        <w:t xml:space="preserve"> create mode 100644 </w:t>
       </w:r>
       <w:proofErr w:type="spellStart"/>
       <w:r>
@@ -742,29 +1450,140 @@
       </w:r>
       <w:proofErr w:type="spellEnd"/>
       <w:r>
-        <w:t xml:space="preserve"> Related files/laytime_sample_pack_v3_with_images.zip</w:t>
-      </w:r>
-    </w:p>
-    <w:p>
-      <w:r>
-        <w:t xml:space="preserve">        new file:   </w:t>
-      </w:r>
-      <w:proofErr w:type="spellStart"/>
-      <w:r>
-        <w:t>zzAll</w:t>
-      </w:r>
-      <w:proofErr w:type="spellEnd"/>
-      <w:r>
         <w:t xml:space="preserve"> Related files/sof_signed_scan.jpg</w:t>
       </w:r>
     </w:p>
+    <w:p>
+      <w:r>
+        <w:t xml:space="preserve"> create mode 100644 ~$</w:t>
+      </w:r>
+      <w:proofErr w:type="spellStart"/>
+      <w:r>
+        <w:t>ferences</w:t>
+      </w:r>
+      <w:proofErr w:type="spellEnd"/>
+      <w:r>
+        <w:t xml:space="preserve"> for Git in Capstone project.docx</w:t>
+      </w:r>
+    </w:p>
     <w:p/>
+    <w:p>
+      <w:pPr>
+        <w:pBdr>
+          <w:bottom w:val="double" w:sz="6" w:space="1" w:color="auto"/>
+        </w:pBdr>
+      </w:pPr>
+      <w:r>
+        <w:t>C:\Users\LENOVO\Documents\Dheeba\Asphero_CapstoneProject&gt;</w:t>
+      </w:r>
+    </w:p>
+    <w:p>
+      <w:r>
+        <w:rPr>
+          <w:highlight w:val="green"/>
+        </w:rPr>
+        <w:t xml:space="preserve">Now push from local git to </w:t>
+      </w:r>
+      <w:r>
+        <w:rPr>
+          <w:highlight w:val="green"/>
+        </w:rPr>
+        <w:t xml:space="preserve">on cloud </w:t>
+      </w:r>
+      <w:proofErr w:type="spellStart"/>
+      <w:r>
+        <w:rPr>
+          <w:highlight w:val="green"/>
+        </w:rPr>
+        <w:t>github</w:t>
+      </w:r>
+      <w:proofErr w:type="spellEnd"/>
+      <w:r>
+        <w:rPr>
+          <w:highlight w:val="green"/>
+        </w:rPr>
+        <w:t>:</w:t>
+      </w:r>
+    </w:p>
+    <w:p>
+      <w:r>
+        <w:t>C:\Users\LENOVO\Documents\Dheeba\Asphero_CapstoneProject&gt;git remote add origin https://github.com/dikshiraj-beep/LaytimeandDemurrageAgent.git</w:t>
+      </w:r>
+    </w:p>
     <w:p/>
     <w:p>
       <w:r>
+        <w:t>C:\Users\LENOVO\Documents\Dheeba\Asphero_CapstoneProject&gt;git branch -M main</w:t>
+      </w:r>
+    </w:p>
+    <w:p/>
+    <w:p>
+      <w:r>
+        <w:t>C:\Users\LENOVO\Documents\Dheeba\Asphero_CapstoneProject&gt;git push -u origin main</w:t>
+      </w:r>
+    </w:p>
+    <w:p>
+      <w:r>
+        <w:t>Enumerating objects: 48, done.</w:t>
+      </w:r>
+    </w:p>
+    <w:p>
+      <w:r>
+        <w:t>Counting objects: 100% (48/48), done.</w:t>
+      </w:r>
+    </w:p>
+    <w:p>
+      <w:r>
+        <w:t>Delta compression using up to 4 threads</w:t>
+      </w:r>
+    </w:p>
+    <w:p>
+      <w:r>
+        <w:t>Compressing objects: 100% (42/42), done.</w:t>
+      </w:r>
+    </w:p>
+    <w:p>
+      <w:r>
+        <w:t>Writing objects: 100% (48/48), 2.76 MiB | 2.38 MiB/s, done.</w:t>
+      </w:r>
+    </w:p>
+    <w:p>
+      <w:r>
+        <w:t>Total 48 (delta 6), reused 48 (delta 6), pack-reused 0 (from 0)</w:t>
+      </w:r>
+    </w:p>
+    <w:p>
+      <w:r>
+        <w:t>remote: Resolving deltas: 100% (6/6), done.</w:t>
+      </w:r>
+    </w:p>
+    <w:p>
+      <w:r>
+        <w:t>To https://github.com/dikshiraj-beep/LaytimeandDemurrageAgent.git</w:t>
+      </w:r>
+    </w:p>
+    <w:p>
+      <w:r>
+        <w:t xml:space="preserve"> * [new branch]      main -&gt; main</w:t>
+      </w:r>
+    </w:p>
+    <w:p>
+      <w:r>
+        <w:t>branch 'main' set up to track 'origin/main'.</w:t>
+      </w:r>
+    </w:p>
+    <w:p/>
+    <w:p>
+      <w:pPr>
+        <w:pBdr>
+          <w:bottom w:val="double" w:sz="6" w:space="1" w:color="auto"/>
+        </w:pBdr>
+      </w:pPr>
+      <w:r>
         <w:t>C:\Users\LENOVO\Documents\Dheeba\Asphero_CapstoneProject&gt;</w:t>
       </w:r>
     </w:p>
+    <w:p/>
     <w:sectPr>
       <w:pgSz w:w="12240" w:h="15840"/>
       <w:pgMar w:top="1440" w:right="1440" w:bottom="1440" w:left="1440" w:header="720" w:footer="720" w:gutter="0"/>

</xml_diff>